<commit_message>
Creative Brief Body Done
</commit_message>
<xml_diff>
--- a/Block B/FinalReport_Maks_Burchard_240894.docx
+++ b/Block B/FinalReport_Maks_Burchard_240894.docx
@@ -382,7 +382,52 @@
           <w:sz w:val="20"/>
           <w:szCs w:val="20"/>
         </w:rPr>
-        <w:t>You determine your business case by understanding the dataset and the features in it that you predict, classify or cluster based on machine learning models.</w:t>
+        <w:t xml:space="preserve">Sometimes, some things are unclear. Especially in the world of healthcare, </w:t>
+      </w:r>
+      <w:r>
+        <w:rPr>
+          <w:rFonts w:ascii="system-ui" w:eastAsia="system-ui" w:hAnsi="system-ui" w:cs="system-ui"/>
+          <w:color w:val="3B3B3B"/>
+          <w:sz w:val="20"/>
+          <w:szCs w:val="20"/>
+        </w:rPr>
+        <w:t xml:space="preserve">where patients may not be willing or able to disclose information. The goal of </w:t>
+      </w:r>
+      <w:r>
+        <w:rPr>
+          <w:rFonts w:ascii="system-ui" w:eastAsia="system-ui" w:hAnsi="system-ui" w:cs="system-ui"/>
+          <w:color w:val="3B3B3B"/>
+          <w:sz w:val="20"/>
+          <w:szCs w:val="20"/>
+        </w:rPr>
+        <w:t>this report</w:t>
+      </w:r>
+      <w:r>
+        <w:rPr>
+          <w:rFonts w:ascii="system-ui" w:eastAsia="system-ui" w:hAnsi="system-ui" w:cs="system-ui"/>
+          <w:color w:val="3B3B3B"/>
+          <w:sz w:val="20"/>
+          <w:szCs w:val="20"/>
+        </w:rPr>
+        <w:t xml:space="preserve"> is to predict the age of the patient based on available data, so </w:t>
+      </w:r>
+      <w:r>
+        <w:rPr>
+          <w:rFonts w:ascii="system-ui" w:eastAsia="system-ui" w:hAnsi="system-ui" w:cs="system-ui"/>
+          <w:color w:val="3B3B3B"/>
+          <w:sz w:val="20"/>
+          <w:szCs w:val="20"/>
+        </w:rPr>
+        <w:t>hospitals</w:t>
+      </w:r>
+      <w:r>
+        <w:rPr>
+          <w:rFonts w:ascii="system-ui" w:eastAsia="system-ui" w:hAnsi="system-ui" w:cs="system-ui"/>
+          <w:color w:val="3B3B3B"/>
+          <w:sz w:val="20"/>
+          <w:szCs w:val="20"/>
+        </w:rPr>
+        <w:t xml:space="preserve"> and medical clinics have a better view on what may be best for a patient. </w:t>
       </w:r>
     </w:p>
     <w:p>
@@ -403,7 +448,7 @@
           <w:sz w:val="20"/>
           <w:szCs w:val="20"/>
         </w:rPr>
-        <w:t xml:space="preserve">Sometimes, some things are unclear. Especially in the world of healthcare, </w:t>
+        <w:t xml:space="preserve">The dataset comes from the University of California Irvine’s Machine Learning Repository and encompasses 50 features, each having </w:t>
       </w:r>
       <w:r>
         <w:rPr>
@@ -412,7 +457,97 @@
           <w:sz w:val="20"/>
           <w:szCs w:val="20"/>
         </w:rPr>
-        <w:t xml:space="preserve">where patients may not be willing or able to disclose information. The goal of what I’m doing here is to predict the age of the patient based on available data, so hospital and medical clinics have a better view on what may be best for a patient. </w:t>
+        <w:t>101</w:t>
+      </w:r>
+      <w:r>
+        <w:rPr>
+          <w:rFonts w:ascii="system-ui" w:eastAsia="system-ui" w:hAnsi="system-ui" w:cs="system-ui"/>
+          <w:color w:val="3B3B3B"/>
+          <w:sz w:val="20"/>
+          <w:szCs w:val="20"/>
+        </w:rPr>
+        <w:t>.</w:t>
+      </w:r>
+      <w:r>
+        <w:rPr>
+          <w:rFonts w:ascii="system-ui" w:eastAsia="system-ui" w:hAnsi="system-ui" w:cs="system-ui"/>
+          <w:color w:val="3B3B3B"/>
+          <w:sz w:val="20"/>
+          <w:szCs w:val="20"/>
+        </w:rPr>
+        <w:t>766</w:t>
+      </w:r>
+      <w:r>
+        <w:rPr>
+          <w:rFonts w:ascii="system-ui" w:eastAsia="system-ui" w:hAnsi="system-ui" w:cs="system-ui"/>
+          <w:color w:val="3B3B3B"/>
+          <w:sz w:val="20"/>
+          <w:szCs w:val="20"/>
+        </w:rPr>
+        <w:t xml:space="preserve"> rows. The data was collected between 1998 and 2008 from 130 </w:t>
+      </w:r>
+      <w:r>
+        <w:rPr>
+          <w:rFonts w:ascii="system-ui" w:eastAsia="system-ui" w:hAnsi="system-ui" w:cs="system-ui"/>
+          <w:color w:val="3B3B3B"/>
+          <w:sz w:val="20"/>
+          <w:szCs w:val="20"/>
+        </w:rPr>
+        <w:t>hospitals and integrated delivery networks</w:t>
+      </w:r>
+      <w:r>
+        <w:rPr>
+          <w:rFonts w:ascii="system-ui" w:eastAsia="system-ui" w:hAnsi="system-ui" w:cs="system-ui"/>
+          <w:color w:val="3B3B3B"/>
+          <w:sz w:val="20"/>
+          <w:szCs w:val="20"/>
+        </w:rPr>
+        <w:t xml:space="preserve"> in the United States of America, from patients who have had diagnosed diabetes and stayed up to 14 days in a hospital. Features include </w:t>
+      </w:r>
+      <w:r>
+        <w:rPr>
+          <w:rFonts w:ascii="system-ui" w:eastAsia="system-ui" w:hAnsi="system-ui" w:cs="system-ui"/>
+          <w:color w:val="3B3B3B"/>
+          <w:sz w:val="20"/>
+          <w:szCs w:val="20"/>
+        </w:rPr>
+        <w:t>IDs</w:t>
+      </w:r>
+      <w:r>
+        <w:rPr>
+          <w:rFonts w:ascii="system-ui" w:eastAsia="system-ui" w:hAnsi="system-ui" w:cs="system-ui"/>
+          <w:color w:val="3B3B3B"/>
+          <w:sz w:val="20"/>
+          <w:szCs w:val="20"/>
+        </w:rPr>
+        <w:t xml:space="preserve"> for patients and encounters, whether certain drugs were prescribed or changed, personal information and </w:t>
+      </w:r>
+      <w:r>
+        <w:rPr>
+          <w:rFonts w:ascii="system-ui" w:eastAsia="system-ui" w:hAnsi="system-ui" w:cs="system-ui"/>
+          <w:color w:val="3B3B3B"/>
+          <w:sz w:val="20"/>
+          <w:szCs w:val="20"/>
+        </w:rPr>
+        <w:t xml:space="preserve">medical history </w:t>
+      </w:r>
+      <w:r>
+        <w:rPr>
+          <w:rFonts w:ascii="system-ui" w:eastAsia="system-ui" w:hAnsi="system-ui" w:cs="system-ui"/>
+          <w:color w:val="3B3B3B"/>
+          <w:sz w:val="20"/>
+          <w:szCs w:val="20"/>
+        </w:rPr>
+        <w:t>of the patients</w:t>
+      </w:r>
+      <w:r>
+        <w:rPr>
+          <w:rFonts w:ascii="system-ui" w:eastAsia="system-ui" w:hAnsi="system-ui" w:cs="system-ui"/>
+          <w:color w:val="3B3B3B"/>
+          <w:sz w:val="20"/>
+          <w:szCs w:val="20"/>
+        </w:rPr>
+        <w:t>.</w:t>
       </w:r>
     </w:p>
     <w:p>
@@ -433,7 +568,7 @@
           <w:sz w:val="20"/>
           <w:szCs w:val="20"/>
         </w:rPr>
-        <w:t xml:space="preserve">The dataset comes from the University of California Irvine’s Machine Learning Repository and encompasses 50 features, each having </w:t>
+        <w:t xml:space="preserve">The three machine learning objectives I did here are predicting, classifying and clustering. I predicted the age of a patient with the use of </w:t>
       </w:r>
       <w:r>
         <w:rPr>
@@ -442,7 +577,7 @@
           <w:sz w:val="20"/>
           <w:szCs w:val="20"/>
         </w:rPr>
-        <w:t>101</w:t>
+        <w:t xml:space="preserve">linear regression, decision tree regression, gradient boosting regression, and XGBoost regression. </w:t>
       </w:r>
       <w:r>
         <w:rPr>
@@ -451,7 +586,7 @@
           <w:sz w:val="20"/>
           <w:szCs w:val="20"/>
         </w:rPr>
-        <w:t>.</w:t>
+        <w:t>After that, I classified the data once again into age, using models such as Logistic Regression, Random Forest Classifier, and K-Nearest Neighbor. Finally, I clustered the data using K-Means Clustering, Random Hierarchical Clustering, and DBSCAN.</w:t>
       </w:r>
       <w:r>
         <w:rPr>
@@ -460,129 +595,15 @@
           <w:sz w:val="20"/>
           <w:szCs w:val="20"/>
         </w:rPr>
-        <w:t>766</w:t>
-      </w:r>
-      <w:r>
-        <w:rPr>
-          <w:rFonts w:ascii="system-ui" w:eastAsia="system-ui" w:hAnsi="system-ui" w:cs="system-ui"/>
-          <w:color w:val="3B3B3B"/>
-          <w:sz w:val="20"/>
-          <w:szCs w:val="20"/>
-        </w:rPr>
-        <w:t xml:space="preserve"> rows. The data was collected between 1998 and 2008 from 130 </w:t>
-      </w:r>
-      <w:r>
-        <w:rPr>
-          <w:rFonts w:ascii="system-ui" w:eastAsia="system-ui" w:hAnsi="system-ui" w:cs="system-ui"/>
-          <w:color w:val="3B3B3B"/>
-          <w:sz w:val="20"/>
-          <w:szCs w:val="20"/>
-        </w:rPr>
-        <w:t>hospitals and integrated delivery networks</w:t>
-      </w:r>
-      <w:r>
-        <w:rPr>
-          <w:rFonts w:ascii="system-ui" w:eastAsia="system-ui" w:hAnsi="system-ui" w:cs="system-ui"/>
-          <w:color w:val="3B3B3B"/>
-          <w:sz w:val="20"/>
-          <w:szCs w:val="20"/>
-        </w:rPr>
-        <w:t xml:space="preserve"> in the United States of America, from patients who have had diagnosed diabetes and stayed up to 14 days in a hospital. Features include </w:t>
-      </w:r>
-      <w:r>
-        <w:rPr>
-          <w:rFonts w:ascii="system-ui" w:eastAsia="system-ui" w:hAnsi="system-ui" w:cs="system-ui"/>
-          <w:color w:val="3B3B3B"/>
-          <w:sz w:val="20"/>
-          <w:szCs w:val="20"/>
-        </w:rPr>
-        <w:t>IDs</w:t>
-      </w:r>
-      <w:r>
-        <w:rPr>
-          <w:rFonts w:ascii="system-ui" w:eastAsia="system-ui" w:hAnsi="system-ui" w:cs="system-ui"/>
-          <w:color w:val="3B3B3B"/>
-          <w:sz w:val="20"/>
-          <w:szCs w:val="20"/>
-        </w:rPr>
-        <w:t xml:space="preserve"> for patients and encounters, whether certain drugs were prescribed or changed, personal information and </w:t>
-      </w:r>
-      <w:r>
-        <w:rPr>
-          <w:rFonts w:ascii="system-ui" w:eastAsia="system-ui" w:hAnsi="system-ui" w:cs="system-ui"/>
-          <w:color w:val="3B3B3B"/>
-          <w:sz w:val="20"/>
-          <w:szCs w:val="20"/>
-        </w:rPr>
-        <w:t xml:space="preserve">medical history </w:t>
-      </w:r>
-      <w:r>
-        <w:rPr>
-          <w:rFonts w:ascii="system-ui" w:eastAsia="system-ui" w:hAnsi="system-ui" w:cs="system-ui"/>
-          <w:color w:val="3B3B3B"/>
-          <w:sz w:val="20"/>
-          <w:szCs w:val="20"/>
-        </w:rPr>
-        <w:t>of the patients</w:t>
-      </w:r>
-      <w:r>
-        <w:rPr>
-          <w:rFonts w:ascii="system-ui" w:eastAsia="system-ui" w:hAnsi="system-ui" w:cs="system-ui"/>
-          <w:color w:val="3B3B3B"/>
-          <w:sz w:val="20"/>
-          <w:szCs w:val="20"/>
-        </w:rPr>
-        <w:t>.</w:t>
+        <w:t xml:space="preserve"> I then evaluated the different models and decided on the best ones for each task.</w:t>
       </w:r>
     </w:p>
     <w:p>
       <w:pPr>
-        <w:spacing w:before="210" w:after="210"/>
-        <w:ind w:left="720"/>
-        <w:rPr>
-          <w:rFonts w:ascii="system-ui" w:eastAsia="system-ui" w:hAnsi="system-ui" w:cs="system-ui"/>
-          <w:b/>
-          <w:bCs/>
-          <w:color w:val="3B3B3B"/>
-          <w:sz w:val="20"/>
-          <w:szCs w:val="20"/>
-        </w:rPr>
-      </w:pPr>
-      <w:r>
-        <w:rPr>
-          <w:rFonts w:ascii="system-ui" w:eastAsia="system-ui" w:hAnsi="system-ui" w:cs="system-ui"/>
-          <w:color w:val="3B3B3B"/>
-          <w:sz w:val="20"/>
-          <w:szCs w:val="20"/>
-        </w:rPr>
-        <w:t xml:space="preserve">The three machine learning objectives I did here are predicting, classifying and clustering. I predicted the age of a patient with the use of </w:t>
-      </w:r>
-      <w:r>
-        <w:rPr>
-          <w:rFonts w:ascii="system-ui" w:eastAsia="system-ui" w:hAnsi="system-ui" w:cs="system-ui"/>
-          <w:color w:val="3B3B3B"/>
-          <w:sz w:val="20"/>
-          <w:szCs w:val="20"/>
-        </w:rPr>
-        <w:t xml:space="preserve">linear regression, decision tree regression, gradient boosting regression, and XGBoost regression. </w:t>
-      </w:r>
-      <w:r>
-        <w:rPr>
-          <w:rFonts w:ascii="system-ui" w:eastAsia="system-ui" w:hAnsi="system-ui" w:cs="system-ui"/>
-          <w:color w:val="3B3B3B"/>
-          <w:sz w:val="20"/>
-          <w:szCs w:val="20"/>
-        </w:rPr>
-        <w:t>After that, I classified the data once again into age, using models such as Logistic Regression, Random Forest Classifier, and K-Nearest Neighbor. Finally, I clustered the data using K-Means Clustering, Random Hierarchical Clustering, and DBSCAN.</w:t>
-      </w:r>
-      <w:r>
-        <w:rPr>
-          <w:rFonts w:ascii="system-ui" w:eastAsia="system-ui" w:hAnsi="system-ui" w:cs="system-ui"/>
-          <w:color w:val="3B3B3B"/>
-          <w:sz w:val="20"/>
-          <w:szCs w:val="20"/>
-        </w:rPr>
-        <w:t xml:space="preserve"> I then evaluated the different models and decided on the best ones for each task.</w:t>
+        <w:pStyle w:val="Heading2"/>
+      </w:pPr>
+      <w:r>
+        <w:t>Problem Statement</w:t>
       </w:r>
     </w:p>
     <w:p>
@@ -590,46 +611,78 @@
         <w:spacing w:after="120"/>
         <w:ind w:left="540"/>
         <w:rPr>
-          <w:color w:val="0D1D31"/>
-          <w:sz w:val="15"/>
-          <w:szCs w:val="15"/>
-        </w:rPr>
-      </w:pPr>
+          <w:rFonts w:ascii="system-ui" w:eastAsia="system-ui" w:hAnsi="system-ui" w:cs="system-ui"/>
+          <w:color w:val="3B3B3B"/>
+          <w:sz w:val="21"/>
+          <w:szCs w:val="21"/>
+        </w:rPr>
+      </w:pPr>
+      <w:r>
+        <w:rPr>
+          <w:rFonts w:ascii="system-ui" w:eastAsia="system-ui" w:hAnsi="system-ui" w:cs="system-ui"/>
+          <w:color w:val="3B3B3B"/>
+          <w:sz w:val="21"/>
+          <w:szCs w:val="21"/>
+        </w:rPr>
+        <w:t>A problem overview explaining your implemented baselines to examine problems that can be addressed by regression or classification or clustering.</w:t>
+      </w:r>
     </w:p>
     <w:p>
       <w:pPr>
         <w:spacing w:after="120"/>
         <w:ind w:left="540"/>
-      </w:pPr>
-    </w:p>
-    <w:p>
-      <w:pPr>
-        <w:pStyle w:val="Heading2"/>
-      </w:pPr>
-      <w:r>
-        <w:t>Problem Statement</w:t>
-      </w:r>
-    </w:p>
-    <w:p>
-      <w:pPr>
-        <w:spacing w:after="120"/>
-        <w:ind w:left="540"/>
-      </w:pPr>
-      <w:r>
-        <w:rPr>
-          <w:rFonts w:ascii="system-ui" w:eastAsia="system-ui" w:hAnsi="system-ui" w:cs="system-ui"/>
-          <w:color w:val="3B3B3B"/>
-          <w:sz w:val="21"/>
-          <w:szCs w:val="21"/>
-        </w:rPr>
-        <w:t>A problem overview explaining your implemented baselines to examine problems that can be addressed by regression or classification or clustering.</w:t>
-      </w:r>
-    </w:p>
-    <w:p>
-      <w:pPr>
-        <w:spacing w:after="120"/>
-        <w:ind w:left="540"/>
-      </w:pPr>
+        <w:rPr>
+          <w:rFonts w:ascii="system-ui" w:eastAsia="system-ui" w:hAnsi="system-ui" w:cs="system-ui"/>
+          <w:color w:val="3B3B3B"/>
+          <w:sz w:val="21"/>
+          <w:szCs w:val="21"/>
+        </w:rPr>
+      </w:pPr>
+      <w:r>
+        <w:rPr>
+          <w:rFonts w:ascii="system-ui" w:eastAsia="system-ui" w:hAnsi="system-ui" w:cs="system-ui"/>
+          <w:color w:val="3B3B3B"/>
+          <w:sz w:val="21"/>
+          <w:szCs w:val="21"/>
+        </w:rPr>
+        <w:t>The main focus</w:t>
+      </w:r>
+      <w:r>
+        <w:rPr>
+          <w:rFonts w:ascii="system-ui" w:eastAsia="system-ui" w:hAnsi="system-ui" w:cs="system-ui"/>
+          <w:color w:val="3B3B3B"/>
+          <w:sz w:val="21"/>
+          <w:szCs w:val="21"/>
+        </w:rPr>
+        <w:t xml:space="preserve"> during this report</w:t>
+      </w:r>
+      <w:r>
+        <w:rPr>
+          <w:rFonts w:ascii="system-ui" w:eastAsia="system-ui" w:hAnsi="system-ui" w:cs="system-ui"/>
+          <w:color w:val="3B3B3B"/>
+          <w:sz w:val="21"/>
+          <w:szCs w:val="21"/>
+        </w:rPr>
+        <w:t xml:space="preserve"> </w:t>
+      </w:r>
+      <w:r>
+        <w:rPr>
+          <w:rFonts w:ascii="system-ui" w:eastAsia="system-ui" w:hAnsi="system-ui" w:cs="system-ui"/>
+          <w:color w:val="3B3B3B"/>
+          <w:sz w:val="21"/>
+          <w:szCs w:val="21"/>
+        </w:rPr>
+        <w:t>was</w:t>
+      </w:r>
+      <w:r>
+        <w:rPr>
+          <w:rFonts w:ascii="system-ui" w:eastAsia="system-ui" w:hAnsi="system-ui" w:cs="system-ui"/>
+          <w:color w:val="3B3B3B"/>
+          <w:sz w:val="21"/>
+          <w:szCs w:val="21"/>
+        </w:rPr>
+        <w:t xml:space="preserve"> on regression, as this is what fits the best to the task at hand, where the goals is to predict the age based on other features.</w:t>
+      </w:r>
     </w:p>
     <w:p>
       <w:pPr>
@@ -659,25 +712,7 @@
           <w:sz w:val="21"/>
           <w:szCs w:val="21"/>
         </w:rPr>
-        <w:t xml:space="preserve">The steps that </w:t>
-      </w:r>
-      <w:proofErr w:type="gramStart"/>
-      <w:r>
-        <w:rPr>
-          <w:color w:val="3B3B3B"/>
-          <w:sz w:val="21"/>
-          <w:szCs w:val="21"/>
-        </w:rPr>
-        <w:t>has</w:t>
-      </w:r>
-      <w:proofErr w:type="gramEnd"/>
-      <w:r>
-        <w:rPr>
-          <w:color w:val="3B3B3B"/>
-          <w:sz w:val="21"/>
-          <w:szCs w:val="21"/>
-        </w:rPr>
-        <w:t xml:space="preserve"> been taken to do EDA in the diabetes dataset</w:t>
+        <w:t>The steps that has been taken to do EDA in the diabetes dataset</w:t>
       </w:r>
     </w:p>
     <w:p/>

</xml_diff>

<commit_message>
Task 3 report done
</commit_message>
<xml_diff>
--- a/Block B/FinalReport_Maks_Burchard_240894.docx
+++ b/Block B/FinalReport_Maks_Burchard_240894.docx
@@ -90,6 +90,7 @@
         </w:rPr>
         <w:t xml:space="preserve">Please, rename the file to </w:t>
       </w:r>
+      <w:proofErr w:type="spellStart"/>
       <w:r>
         <w:rPr>
           <w:rFonts w:ascii="system-ui" w:eastAsia="system-ui" w:hAnsi="system-ui" w:cs="system-ui"/>
@@ -98,7 +99,62 @@
           <w:szCs w:val="21"/>
           <w:highlight w:val="cyan"/>
         </w:rPr>
-        <w:t>FinalReport_&lt;your_name&gt;_&lt;studentnumber&gt;.</w:t>
+        <w:t>FinalReport</w:t>
+      </w:r>
+      <w:proofErr w:type="spellEnd"/>
+      <w:r>
+        <w:rPr>
+          <w:rFonts w:ascii="system-ui" w:eastAsia="system-ui" w:hAnsi="system-ui" w:cs="system-ui"/>
+          <w:color w:val="222222"/>
+          <w:sz w:val="21"/>
+          <w:szCs w:val="21"/>
+          <w:highlight w:val="cyan"/>
+        </w:rPr>
+        <w:t>_&lt;</w:t>
+      </w:r>
+      <w:proofErr w:type="spellStart"/>
+      <w:r>
+        <w:rPr>
+          <w:rFonts w:ascii="system-ui" w:eastAsia="system-ui" w:hAnsi="system-ui" w:cs="system-ui"/>
+          <w:color w:val="222222"/>
+          <w:sz w:val="21"/>
+          <w:szCs w:val="21"/>
+          <w:highlight w:val="cyan"/>
+        </w:rPr>
+        <w:t>your_name</w:t>
+      </w:r>
+      <w:proofErr w:type="spellEnd"/>
+      <w:r>
+        <w:rPr>
+          <w:rFonts w:ascii="system-ui" w:eastAsia="system-ui" w:hAnsi="system-ui" w:cs="system-ui"/>
+          <w:color w:val="222222"/>
+          <w:sz w:val="21"/>
+          <w:szCs w:val="21"/>
+          <w:highlight w:val="cyan"/>
+        </w:rPr>
+        <w:t>&gt;_&lt;</w:t>
+      </w:r>
+      <w:proofErr w:type="spellStart"/>
+      <w:r>
+        <w:rPr>
+          <w:rFonts w:ascii="system-ui" w:eastAsia="system-ui" w:hAnsi="system-ui" w:cs="system-ui"/>
+          <w:color w:val="222222"/>
+          <w:sz w:val="21"/>
+          <w:szCs w:val="21"/>
+          <w:highlight w:val="cyan"/>
+        </w:rPr>
+        <w:t>studentnumber</w:t>
+      </w:r>
+      <w:proofErr w:type="spellEnd"/>
+      <w:r>
+        <w:rPr>
+          <w:rFonts w:ascii="system-ui" w:eastAsia="system-ui" w:hAnsi="system-ui" w:cs="system-ui"/>
+          <w:color w:val="222222"/>
+          <w:sz w:val="21"/>
+          <w:szCs w:val="21"/>
+          <w:highlight w:val="cyan"/>
+        </w:rPr>
+        <w:t>&gt;.</w:t>
       </w:r>
       <w:r>
         <w:rPr>
@@ -144,7 +200,27 @@
           <w:sz w:val="21"/>
           <w:szCs w:val="21"/>
         </w:rPr>
-        <w:t>Upload this template to the 'Deliverables' folder in your BUas GitHub repository.</w:t>
+        <w:t xml:space="preserve">Upload this template to the 'Deliverables' folder in your </w:t>
+      </w:r>
+      <w:proofErr w:type="spellStart"/>
+      <w:r>
+        <w:rPr>
+          <w:rFonts w:ascii="system-ui" w:eastAsia="system-ui" w:hAnsi="system-ui" w:cs="system-ui"/>
+          <w:color w:val="222222"/>
+          <w:sz w:val="21"/>
+          <w:szCs w:val="21"/>
+        </w:rPr>
+        <w:t>BUas</w:t>
+      </w:r>
+      <w:proofErr w:type="spellEnd"/>
+      <w:r>
+        <w:rPr>
+          <w:rFonts w:ascii="system-ui" w:eastAsia="system-ui" w:hAnsi="system-ui" w:cs="system-ui"/>
+          <w:color w:val="222222"/>
+          <w:sz w:val="21"/>
+          <w:szCs w:val="21"/>
+        </w:rPr>
+        <w:t xml:space="preserve"> GitHub repository.</w:t>
       </w:r>
     </w:p>
     <w:p>
@@ -447,7 +523,27 @@
           <w:sz w:val="20"/>
           <w:szCs w:val="20"/>
         </w:rPr>
-        <w:t xml:space="preserve">linear regression, decision tree regression, gradient boosting regression, and XGBoost regression. </w:t>
+        <w:t xml:space="preserve">linear regression, decision tree regression, gradient boosting regression, and </w:t>
+      </w:r>
+      <w:proofErr w:type="spellStart"/>
+      <w:r>
+        <w:rPr>
+          <w:rFonts w:ascii="system-ui" w:eastAsia="system-ui" w:hAnsi="system-ui" w:cs="system-ui"/>
+          <w:color w:val="3B3B3B"/>
+          <w:sz w:val="20"/>
+          <w:szCs w:val="20"/>
+        </w:rPr>
+        <w:t>XGBoost</w:t>
+      </w:r>
+      <w:proofErr w:type="spellEnd"/>
+      <w:r>
+        <w:rPr>
+          <w:rFonts w:ascii="system-ui" w:eastAsia="system-ui" w:hAnsi="system-ui" w:cs="system-ui"/>
+          <w:color w:val="3B3B3B"/>
+          <w:sz w:val="20"/>
+          <w:szCs w:val="20"/>
+        </w:rPr>
+        <w:t xml:space="preserve"> regression. </w:t>
       </w:r>
       <w:r>
         <w:rPr>
@@ -982,7 +1078,47 @@
           <w:szCs w:val="21"/>
         </w:rPr>
         <w:lastRenderedPageBreak/>
-        <w:t>both the “examide” and “citoglipton” columns had one value, and would therefore be useless for any task.</w:t>
+        <w:t>both the “</w:t>
+      </w:r>
+      <w:proofErr w:type="spellStart"/>
+      <w:r>
+        <w:rPr>
+          <w:rFonts w:eastAsia="system-ui" w:cs="system-ui"/>
+          <w:color w:val="3B3B3B"/>
+          <w:sz w:val="21"/>
+          <w:szCs w:val="21"/>
+        </w:rPr>
+        <w:t>examide</w:t>
+      </w:r>
+      <w:proofErr w:type="spellEnd"/>
+      <w:r>
+        <w:rPr>
+          <w:rFonts w:eastAsia="system-ui" w:cs="system-ui"/>
+          <w:color w:val="3B3B3B"/>
+          <w:sz w:val="21"/>
+          <w:szCs w:val="21"/>
+        </w:rPr>
+        <w:t>” and “</w:t>
+      </w:r>
+      <w:proofErr w:type="spellStart"/>
+      <w:r>
+        <w:rPr>
+          <w:rFonts w:eastAsia="system-ui" w:cs="system-ui"/>
+          <w:color w:val="3B3B3B"/>
+          <w:sz w:val="21"/>
+          <w:szCs w:val="21"/>
+        </w:rPr>
+        <w:t>citoglipton</w:t>
+      </w:r>
+      <w:proofErr w:type="spellEnd"/>
+      <w:r>
+        <w:rPr>
+          <w:rFonts w:eastAsia="system-ui" w:cs="system-ui"/>
+          <w:color w:val="3B3B3B"/>
+          <w:sz w:val="21"/>
+          <w:szCs w:val="21"/>
+        </w:rPr>
+        <w:t>” columns had one value, and would therefore be useless for any task.</w:t>
       </w:r>
     </w:p>
     <w:p/>
@@ -1371,7 +1507,25 @@
           <w:sz w:val="21"/>
           <w:szCs w:val="21"/>
         </w:rPr>
-        <w:t>A simple search for the amount of nan values reveals two columns with nan values: “max_glu_serum” and “A1Cresult”. Knowing the shape of the data from previous steps and seeing the amount of nan values here made it immediately clear that both columns had a large percentage of missing values, and after calculations, this turned out to be correct, as the columns had 95% and 83%</w:t>
+        <w:t>A simple search for the amount of nan values reveals two columns with nan values: “</w:t>
+      </w:r>
+      <w:proofErr w:type="spellStart"/>
+      <w:r>
+        <w:rPr>
+          <w:color w:val="3B3B3B"/>
+          <w:sz w:val="21"/>
+          <w:szCs w:val="21"/>
+        </w:rPr>
+        <w:t>max_glu_serum</w:t>
+      </w:r>
+      <w:proofErr w:type="spellEnd"/>
+      <w:r>
+        <w:rPr>
+          <w:color w:val="3B3B3B"/>
+          <w:sz w:val="21"/>
+          <w:szCs w:val="21"/>
+        </w:rPr>
+        <w:t>” and “A1Cresult”. Knowing the shape of the data from previous steps and seeing the amount of nan values here made it immediately clear that both columns had a large percentage of missing values, and after calculations, this turned out to be correct, as the columns had 95% and 83%</w:t>
       </w:r>
       <w:r>
         <w:rPr>
@@ -1480,7 +1634,43 @@
           <w:sz w:val="21"/>
           <w:szCs w:val="21"/>
         </w:rPr>
-        <w:t>The big one was “weight”, consisting of 97% of missing values. The columns “payer_code” and “medical_specialty” also had large amounts of missing values with 40% and 49% respectively. Other columns such as “race”, “diag_1”, “diag_2”, and “diag_3” also had missing values, but in small amounts, as none of those exceeded 2,5%.</w:t>
+        <w:t>The big one was “weight”, consisting of 97% of missing values. The columns “</w:t>
+      </w:r>
+      <w:proofErr w:type="spellStart"/>
+      <w:r>
+        <w:rPr>
+          <w:color w:val="3B3B3B"/>
+          <w:sz w:val="21"/>
+          <w:szCs w:val="21"/>
+        </w:rPr>
+        <w:t>payer_code</w:t>
+      </w:r>
+      <w:proofErr w:type="spellEnd"/>
+      <w:r>
+        <w:rPr>
+          <w:color w:val="3B3B3B"/>
+          <w:sz w:val="21"/>
+          <w:szCs w:val="21"/>
+        </w:rPr>
+        <w:t>” and “</w:t>
+      </w:r>
+      <w:proofErr w:type="spellStart"/>
+      <w:r>
+        <w:rPr>
+          <w:color w:val="3B3B3B"/>
+          <w:sz w:val="21"/>
+          <w:szCs w:val="21"/>
+        </w:rPr>
+        <w:t>medical_specialty</w:t>
+      </w:r>
+      <w:proofErr w:type="spellEnd"/>
+      <w:r>
+        <w:rPr>
+          <w:color w:val="3B3B3B"/>
+          <w:sz w:val="21"/>
+          <w:szCs w:val="21"/>
+        </w:rPr>
+        <w:t>” also had large amounts of missing values with 40% and 49% respectively. Other columns such as “race”, “diag_1”, “diag_2”, and “diag_3” also had missing values, but in small amounts, as none of those exceeded 2,5%.</w:t>
       </w:r>
     </w:p>
     <w:p>
@@ -2553,7 +2743,23 @@
           <w:rFonts w:eastAsia="system-ui"/>
           <w:color w:val="auto"/>
         </w:rPr>
-        <w:t>3.1.6: Implement XGBoost Regression</w:t>
+        <w:t xml:space="preserve">3.1.6: Implement </w:t>
+      </w:r>
+      <w:proofErr w:type="spellStart"/>
+      <w:r>
+        <w:rPr>
+          <w:rFonts w:eastAsia="system-ui"/>
+          <w:color w:val="auto"/>
+        </w:rPr>
+        <w:t>XGBoost</w:t>
+      </w:r>
+      <w:proofErr w:type="spellEnd"/>
+      <w:r>
+        <w:rPr>
+          <w:rFonts w:eastAsia="system-ui"/>
+          <w:color w:val="auto"/>
+        </w:rPr>
+        <w:t xml:space="preserve"> Regression</w:t>
       </w:r>
     </w:p>
     <w:p>
@@ -2574,8 +2780,19 @@
           <w:sz w:val="21"/>
           <w:szCs w:val="21"/>
         </w:rPr>
-        <w:t>The fourth and final model I implemented for regression was XGBoost</w:t>
-      </w:r>
+        <w:t xml:space="preserve">The fourth and final model I implemented for regression was </w:t>
+      </w:r>
+      <w:proofErr w:type="spellStart"/>
+      <w:r>
+        <w:rPr>
+          <w:rFonts w:eastAsia="system-ui" w:cs="system-ui"/>
+          <w:color w:val="3B3B3B"/>
+          <w:sz w:val="21"/>
+          <w:szCs w:val="21"/>
+        </w:rPr>
+        <w:t>XGBoost</w:t>
+      </w:r>
+      <w:proofErr w:type="spellEnd"/>
       <w:r>
         <w:rPr>
           <w:rFonts w:eastAsia="system-ui" w:cs="system-ui"/>
@@ -2701,7 +2918,27 @@
           <w:sz w:val="21"/>
           <w:szCs w:val="21"/>
         </w:rPr>
-        <w:t xml:space="preserve"> have a spike between 0.6 and 0.7, although their distribution are different. From the visuals it can be seen that the decision tree regressor predicts values between 0.2 and 0.9 while the gradient boosting regressor predicts between 0.5 and 0.8. The XGBoost regressor ha</w:t>
+        <w:t xml:space="preserve"> have a spike between 0.6 and 0.7, although their distribution are different. From the visuals it can be seen that the decision tree regressor predicts values between 0.2 and 0.9 while the gradient boosting regressor predicts between 0.5 and 0.8. The </w:t>
+      </w:r>
+      <w:proofErr w:type="spellStart"/>
+      <w:r>
+        <w:rPr>
+          <w:rFonts w:eastAsia="system-ui" w:cs="system-ui"/>
+          <w:color w:val="3B3B3B"/>
+          <w:sz w:val="21"/>
+          <w:szCs w:val="21"/>
+        </w:rPr>
+        <w:t>XGBoost</w:t>
+      </w:r>
+      <w:proofErr w:type="spellEnd"/>
+      <w:r>
+        <w:rPr>
+          <w:rFonts w:eastAsia="system-ui" w:cs="system-ui"/>
+          <w:color w:val="3B3B3B"/>
+          <w:sz w:val="21"/>
+          <w:szCs w:val="21"/>
+        </w:rPr>
+        <w:t xml:space="preserve"> regressor ha</w:t>
       </w:r>
       <w:r>
         <w:rPr>
@@ -2810,7 +3047,27 @@
           <w:sz w:val="21"/>
           <w:szCs w:val="21"/>
         </w:rPr>
-        <w:t xml:space="preserve"> from each model. The decision tree just slightly beats gradient boosting and linear regression, while XGBoost is far behind.</w:t>
+        <w:t xml:space="preserve"> from each model. The decision tree just slightly beats gradient boosting and linear regression, while </w:t>
+      </w:r>
+      <w:proofErr w:type="spellStart"/>
+      <w:r>
+        <w:rPr>
+          <w:rFonts w:eastAsia="system-ui" w:cs="system-ui"/>
+          <w:color w:val="3B3B3B"/>
+          <w:sz w:val="21"/>
+          <w:szCs w:val="21"/>
+        </w:rPr>
+        <w:t>XGBoost</w:t>
+      </w:r>
+      <w:proofErr w:type="spellEnd"/>
+      <w:r>
+        <w:rPr>
+          <w:rFonts w:eastAsia="system-ui" w:cs="system-ui"/>
+          <w:color w:val="3B3B3B"/>
+          <w:sz w:val="21"/>
+          <w:szCs w:val="21"/>
+        </w:rPr>
+        <w:t xml:space="preserve"> is far behind.</w:t>
       </w:r>
       <w:r>
         <w:rPr>
@@ -3181,7 +3438,27 @@
           <w:sz w:val="21"/>
           <w:szCs w:val="21"/>
         </w:rPr>
-        <w:t>As is immediately visible from the code, I did hyperparameter tuning on the algorithm for the n_neighbours parameter. I calculated the four evaluation metrics for each value of the parameter between 2 and 20 and then visualised it in a graph to easily tell which one had the highest metrics. From said visual, it can be concluded that the optimal value for the parameter is 17,</w:t>
+        <w:t xml:space="preserve">As is immediately visible from the code, I did hyperparameter tuning on the algorithm for the </w:t>
+      </w:r>
+      <w:proofErr w:type="spellStart"/>
+      <w:r>
+        <w:rPr>
+          <w:rFonts w:eastAsia="system-ui" w:cs="system-ui"/>
+          <w:color w:val="3B3B3B"/>
+          <w:sz w:val="21"/>
+          <w:szCs w:val="21"/>
+        </w:rPr>
+        <w:t>n_neighbours</w:t>
+      </w:r>
+      <w:proofErr w:type="spellEnd"/>
+      <w:r>
+        <w:rPr>
+          <w:rFonts w:eastAsia="system-ui" w:cs="system-ui"/>
+          <w:color w:val="3B3B3B"/>
+          <w:sz w:val="21"/>
+          <w:szCs w:val="21"/>
+        </w:rPr>
+        <w:t xml:space="preserve"> parameter. I calculated the four evaluation metrics for each value of the parameter between 2 and 20 and then visualised it in a graph to easily tell which one had the highest metrics. From said visual, it can be concluded that the optimal value for the parameter is 17,</w:t>
       </w:r>
       <w:r>
         <w:rPr>
@@ -3840,7 +4117,167 @@
           <w:sz w:val="21"/>
           <w:szCs w:val="21"/>
         </w:rPr>
-        <w:t>a combination of the importance identified by the random forest classifier (rfc) and XGBoost regressor. I divided the importance as given by the rfc by the importance given by XGBoost. This created a bit of a problem as XGBoost can remove features from its importance list while rfc cannot. And since dividing by 0 is not possible, this would cause an error. Instead of simply swapping the numerator and denominator, I decided to challenge myself to try and solve this problem by dropping the columns missing in the XGBoost importance list in the rfc list.</w:t>
+        <w:t>a combination of the importance identified by the random forest classifier (</w:t>
+      </w:r>
+      <w:proofErr w:type="spellStart"/>
+      <w:r>
+        <w:rPr>
+          <w:rFonts w:eastAsia="system-ui" w:cs="system-ui"/>
+          <w:color w:val="3B3B3B"/>
+          <w:sz w:val="21"/>
+          <w:szCs w:val="21"/>
+        </w:rPr>
+        <w:t>rfc</w:t>
+      </w:r>
+      <w:proofErr w:type="spellEnd"/>
+      <w:r>
+        <w:rPr>
+          <w:rFonts w:eastAsia="system-ui" w:cs="system-ui"/>
+          <w:color w:val="3B3B3B"/>
+          <w:sz w:val="21"/>
+          <w:szCs w:val="21"/>
+        </w:rPr>
+        <w:t xml:space="preserve">) and </w:t>
+      </w:r>
+      <w:proofErr w:type="spellStart"/>
+      <w:r>
+        <w:rPr>
+          <w:rFonts w:eastAsia="system-ui" w:cs="system-ui"/>
+          <w:color w:val="3B3B3B"/>
+          <w:sz w:val="21"/>
+          <w:szCs w:val="21"/>
+        </w:rPr>
+        <w:t>XGBoost</w:t>
+      </w:r>
+      <w:proofErr w:type="spellEnd"/>
+      <w:r>
+        <w:rPr>
+          <w:rFonts w:eastAsia="system-ui" w:cs="system-ui"/>
+          <w:color w:val="3B3B3B"/>
+          <w:sz w:val="21"/>
+          <w:szCs w:val="21"/>
+        </w:rPr>
+        <w:t xml:space="preserve"> regressor. I divided the importance as given by the </w:t>
+      </w:r>
+      <w:proofErr w:type="spellStart"/>
+      <w:r>
+        <w:rPr>
+          <w:rFonts w:eastAsia="system-ui" w:cs="system-ui"/>
+          <w:color w:val="3B3B3B"/>
+          <w:sz w:val="21"/>
+          <w:szCs w:val="21"/>
+        </w:rPr>
+        <w:t>rfc</w:t>
+      </w:r>
+      <w:proofErr w:type="spellEnd"/>
+      <w:r>
+        <w:rPr>
+          <w:rFonts w:eastAsia="system-ui" w:cs="system-ui"/>
+          <w:color w:val="3B3B3B"/>
+          <w:sz w:val="21"/>
+          <w:szCs w:val="21"/>
+        </w:rPr>
+        <w:t xml:space="preserve"> by the importance given by </w:t>
+      </w:r>
+      <w:proofErr w:type="spellStart"/>
+      <w:r>
+        <w:rPr>
+          <w:rFonts w:eastAsia="system-ui" w:cs="system-ui"/>
+          <w:color w:val="3B3B3B"/>
+          <w:sz w:val="21"/>
+          <w:szCs w:val="21"/>
+        </w:rPr>
+        <w:t>XGBoost</w:t>
+      </w:r>
+      <w:proofErr w:type="spellEnd"/>
+      <w:r>
+        <w:rPr>
+          <w:rFonts w:eastAsia="system-ui" w:cs="system-ui"/>
+          <w:color w:val="3B3B3B"/>
+          <w:sz w:val="21"/>
+          <w:szCs w:val="21"/>
+        </w:rPr>
+        <w:t xml:space="preserve">. This created a bit of a problem as </w:t>
+      </w:r>
+      <w:proofErr w:type="spellStart"/>
+      <w:r>
+        <w:rPr>
+          <w:rFonts w:eastAsia="system-ui" w:cs="system-ui"/>
+          <w:color w:val="3B3B3B"/>
+          <w:sz w:val="21"/>
+          <w:szCs w:val="21"/>
+        </w:rPr>
+        <w:t>XGBoost</w:t>
+      </w:r>
+      <w:proofErr w:type="spellEnd"/>
+      <w:r>
+        <w:rPr>
+          <w:rFonts w:eastAsia="system-ui" w:cs="system-ui"/>
+          <w:color w:val="3B3B3B"/>
+          <w:sz w:val="21"/>
+          <w:szCs w:val="21"/>
+        </w:rPr>
+        <w:t xml:space="preserve"> can remove features from its importance list while </w:t>
+      </w:r>
+      <w:proofErr w:type="spellStart"/>
+      <w:r>
+        <w:rPr>
+          <w:rFonts w:eastAsia="system-ui" w:cs="system-ui"/>
+          <w:color w:val="3B3B3B"/>
+          <w:sz w:val="21"/>
+          <w:szCs w:val="21"/>
+        </w:rPr>
+        <w:t>rfc</w:t>
+      </w:r>
+      <w:proofErr w:type="spellEnd"/>
+      <w:r>
+        <w:rPr>
+          <w:rFonts w:eastAsia="system-ui" w:cs="system-ui"/>
+          <w:color w:val="3B3B3B"/>
+          <w:sz w:val="21"/>
+          <w:szCs w:val="21"/>
+        </w:rPr>
+        <w:t xml:space="preserve"> cannot. And since dividing by 0 is not possible, this would cause an error. Instead of simply swapping the numerator and denominator, I decided to challenge myself to try and solve this problem by dropping the columns missing in the </w:t>
+      </w:r>
+      <w:proofErr w:type="spellStart"/>
+      <w:r>
+        <w:rPr>
+          <w:rFonts w:eastAsia="system-ui" w:cs="system-ui"/>
+          <w:color w:val="3B3B3B"/>
+          <w:sz w:val="21"/>
+          <w:szCs w:val="21"/>
+        </w:rPr>
+        <w:t>XGBoost</w:t>
+      </w:r>
+      <w:proofErr w:type="spellEnd"/>
+      <w:r>
+        <w:rPr>
+          <w:rFonts w:eastAsia="system-ui" w:cs="system-ui"/>
+          <w:color w:val="3B3B3B"/>
+          <w:sz w:val="21"/>
+          <w:szCs w:val="21"/>
+        </w:rPr>
+        <w:t xml:space="preserve"> importance list in the </w:t>
+      </w:r>
+      <w:proofErr w:type="spellStart"/>
+      <w:r>
+        <w:rPr>
+          <w:rFonts w:eastAsia="system-ui" w:cs="system-ui"/>
+          <w:color w:val="3B3B3B"/>
+          <w:sz w:val="21"/>
+          <w:szCs w:val="21"/>
+        </w:rPr>
+        <w:t>rfc</w:t>
+      </w:r>
+      <w:proofErr w:type="spellEnd"/>
+      <w:r>
+        <w:rPr>
+          <w:rFonts w:eastAsia="system-ui" w:cs="system-ui"/>
+          <w:color w:val="3B3B3B"/>
+          <w:sz w:val="21"/>
+          <w:szCs w:val="21"/>
+        </w:rPr>
+        <w:t xml:space="preserve"> list.</w:t>
       </w:r>
       <w:r>
         <w:rPr>
@@ -4011,7 +4448,23 @@
           <w:rFonts w:eastAsia="system-ui"/>
           <w:color w:val="auto"/>
         </w:rPr>
-        <w:t>3.5.1: GridSearchCV for Systematic Hyperparameter Tuning</w:t>
+        <w:t xml:space="preserve">3.5.1: </w:t>
+      </w:r>
+      <w:proofErr w:type="spellStart"/>
+      <w:r>
+        <w:rPr>
+          <w:rFonts w:eastAsia="system-ui"/>
+          <w:color w:val="auto"/>
+        </w:rPr>
+        <w:t>GridSearchCV</w:t>
+      </w:r>
+      <w:proofErr w:type="spellEnd"/>
+      <w:r>
+        <w:rPr>
+          <w:rFonts w:eastAsia="system-ui"/>
+          <w:color w:val="auto"/>
+        </w:rPr>
+        <w:t xml:space="preserve"> for Systematic Hyperparameter Tuning</w:t>
       </w:r>
     </w:p>
     <w:p>
@@ -4025,23 +4478,54 @@
           <w:szCs w:val="21"/>
         </w:rPr>
       </w:pPr>
-      <w:r>
-        <w:rPr>
-          <w:rFonts w:eastAsia="system-ui" w:cs="system-ui"/>
-          <w:color w:val="3B3B3B"/>
-          <w:sz w:val="21"/>
-          <w:szCs w:val="21"/>
-        </w:rPr>
-        <w:t xml:space="preserve">GridSearchCV is a function that takes a grid of parameters and runs through all possible combinations. That is what I would use to tune the hyperparameters here. </w:t>
-      </w:r>
-      <w:r>
-        <w:rPr>
-          <w:rFonts w:eastAsia="system-ui" w:cs="system-ui"/>
-          <w:color w:val="3B3B3B"/>
-          <w:sz w:val="21"/>
-          <w:szCs w:val="21"/>
-        </w:rPr>
-        <w:t xml:space="preserve">The first step while using GridSearchCV is to create the parameter grid. I decided on tuning the hyperparameters of three models: decision tree regressor for regression, logistic regressor for classification and K-means for clustering. I created the grid for each of the models here. For the logistic regressor, I </w:t>
+      <w:proofErr w:type="spellStart"/>
+      <w:r>
+        <w:rPr>
+          <w:rFonts w:eastAsia="system-ui" w:cs="system-ui"/>
+          <w:color w:val="3B3B3B"/>
+          <w:sz w:val="21"/>
+          <w:szCs w:val="21"/>
+        </w:rPr>
+        <w:t>GridSearchCV</w:t>
+      </w:r>
+      <w:proofErr w:type="spellEnd"/>
+      <w:r>
+        <w:rPr>
+          <w:rFonts w:eastAsia="system-ui" w:cs="system-ui"/>
+          <w:color w:val="3B3B3B"/>
+          <w:sz w:val="21"/>
+          <w:szCs w:val="21"/>
+        </w:rPr>
+        <w:t xml:space="preserve"> is a function that takes a grid of parameters and runs through all possible combinations. That is what I would use to tune the hyperparameters here. </w:t>
+      </w:r>
+      <w:r>
+        <w:rPr>
+          <w:rFonts w:eastAsia="system-ui" w:cs="system-ui"/>
+          <w:color w:val="3B3B3B"/>
+          <w:sz w:val="21"/>
+          <w:szCs w:val="21"/>
+        </w:rPr>
+        <w:t xml:space="preserve">The first step while using </w:t>
+      </w:r>
+      <w:proofErr w:type="spellStart"/>
+      <w:r>
+        <w:rPr>
+          <w:rFonts w:eastAsia="system-ui" w:cs="system-ui"/>
+          <w:color w:val="3B3B3B"/>
+          <w:sz w:val="21"/>
+          <w:szCs w:val="21"/>
+        </w:rPr>
+        <w:t>GridSearchCV</w:t>
+      </w:r>
+      <w:proofErr w:type="spellEnd"/>
+      <w:r>
+        <w:rPr>
+          <w:rFonts w:eastAsia="system-ui" w:cs="system-ui"/>
+          <w:color w:val="3B3B3B"/>
+          <w:sz w:val="21"/>
+          <w:szCs w:val="21"/>
+        </w:rPr>
+        <w:t xml:space="preserve"> is to create the parameter grid. I decided on tuning the hyperparameters of three models: decision tree regressor for regression, logistic regressor for classification and K-means for clustering. I created the grid for each of the models here. For the logistic regressor, I </w:t>
       </w:r>
       <w:r>
         <w:rPr>
@@ -4051,7 +4535,27 @@
           <w:szCs w:val="21"/>
         </w:rPr>
         <w:lastRenderedPageBreak/>
-        <w:t>decided to include the ‘l1_ratio’ parameter, knowing it would make some of the folds fail as it was only required for the ‘elasticnet’ penalty parameter.</w:t>
+        <w:t>decided to include the ‘l1_ratio’ parameter, knowing it would make some of the folds fail as it was only required for the ‘</w:t>
+      </w:r>
+      <w:proofErr w:type="spellStart"/>
+      <w:r>
+        <w:rPr>
+          <w:rFonts w:eastAsia="system-ui" w:cs="system-ui"/>
+          <w:color w:val="3B3B3B"/>
+          <w:sz w:val="21"/>
+          <w:szCs w:val="21"/>
+        </w:rPr>
+        <w:t>elasticnet</w:t>
+      </w:r>
+      <w:proofErr w:type="spellEnd"/>
+      <w:r>
+        <w:rPr>
+          <w:rFonts w:eastAsia="system-ui" w:cs="system-ui"/>
+          <w:color w:val="3B3B3B"/>
+          <w:sz w:val="21"/>
+          <w:szCs w:val="21"/>
+        </w:rPr>
+        <w:t>’ penalty parameter.</w:t>
       </w:r>
     </w:p>
     <w:p>
@@ -4067,7 +4571,23 @@
           <w:rFonts w:eastAsia="system-ui"/>
           <w:color w:val="auto"/>
         </w:rPr>
-        <w:t>3.5.2: Apply GridSearchCV with Cross-Validation</w:t>
+        <w:t xml:space="preserve">3.5.2: Apply </w:t>
+      </w:r>
+      <w:proofErr w:type="spellStart"/>
+      <w:r>
+        <w:rPr>
+          <w:rFonts w:eastAsia="system-ui"/>
+          <w:color w:val="auto"/>
+        </w:rPr>
+        <w:t>GridSearchCV</w:t>
+      </w:r>
+      <w:proofErr w:type="spellEnd"/>
+      <w:r>
+        <w:rPr>
+          <w:rFonts w:eastAsia="system-ui"/>
+          <w:color w:val="auto"/>
+        </w:rPr>
+        <w:t xml:space="preserve"> with Cross-Validation</w:t>
       </w:r>
     </w:p>
     <w:p>
@@ -4088,16 +4608,56 @@
           <w:sz w:val="21"/>
           <w:szCs w:val="21"/>
         </w:rPr>
-        <w:t xml:space="preserve">After creating the grid, I had to now use GridSearchCV with the </w:t>
-      </w:r>
-      <w:r>
-        <w:rPr>
-          <w:rFonts w:eastAsia="system-ui" w:cs="system-ui"/>
-          <w:color w:val="3B3B3B"/>
-          <w:sz w:val="21"/>
-          <w:szCs w:val="21"/>
-        </w:rPr>
-        <w:t>selected models. I split each count of GridSearchCV into its own cell as the process was computationally heavy and this would be helpful for debugging, since it wouldn’t require me to wait for the previous functions to finish before it showed an error.</w:t>
+        <w:t xml:space="preserve">After creating the grid, I had to now use </w:t>
+      </w:r>
+      <w:proofErr w:type="spellStart"/>
+      <w:r>
+        <w:rPr>
+          <w:rFonts w:eastAsia="system-ui" w:cs="system-ui"/>
+          <w:color w:val="3B3B3B"/>
+          <w:sz w:val="21"/>
+          <w:szCs w:val="21"/>
+        </w:rPr>
+        <w:t>GridSearchCV</w:t>
+      </w:r>
+      <w:proofErr w:type="spellEnd"/>
+      <w:r>
+        <w:rPr>
+          <w:rFonts w:eastAsia="system-ui" w:cs="system-ui"/>
+          <w:color w:val="3B3B3B"/>
+          <w:sz w:val="21"/>
+          <w:szCs w:val="21"/>
+        </w:rPr>
+        <w:t xml:space="preserve"> with the </w:t>
+      </w:r>
+      <w:r>
+        <w:rPr>
+          <w:rFonts w:eastAsia="system-ui" w:cs="system-ui"/>
+          <w:color w:val="3B3B3B"/>
+          <w:sz w:val="21"/>
+          <w:szCs w:val="21"/>
+        </w:rPr>
+        <w:t xml:space="preserve">selected models. I split each count of </w:t>
+      </w:r>
+      <w:proofErr w:type="spellStart"/>
+      <w:r>
+        <w:rPr>
+          <w:rFonts w:eastAsia="system-ui" w:cs="system-ui"/>
+          <w:color w:val="3B3B3B"/>
+          <w:sz w:val="21"/>
+          <w:szCs w:val="21"/>
+        </w:rPr>
+        <w:t>GridSearchCV</w:t>
+      </w:r>
+      <w:proofErr w:type="spellEnd"/>
+      <w:r>
+        <w:rPr>
+          <w:rFonts w:eastAsia="system-ui" w:cs="system-ui"/>
+          <w:color w:val="3B3B3B"/>
+          <w:sz w:val="21"/>
+          <w:szCs w:val="21"/>
+        </w:rPr>
+        <w:t xml:space="preserve"> into its own cell as the process was computationally heavy and this would be helpful for debugging, since it wouldn’t require me to wait for the previous functions to finish before it showed an error.</w:t>
       </w:r>
       <w:r>
         <w:rPr>
@@ -4143,7 +4703,27 @@
           <w:sz w:val="21"/>
           <w:szCs w:val="21"/>
         </w:rPr>
-        <w:t>After running the GridSearchCV it was time to check how well it had performed. For this purpose, I used nested cross-validation</w:t>
+        <w:t xml:space="preserve">After running the </w:t>
+      </w:r>
+      <w:proofErr w:type="spellStart"/>
+      <w:r>
+        <w:rPr>
+          <w:rFonts w:eastAsia="system-ui" w:cs="system-ui"/>
+          <w:color w:val="3B3B3B"/>
+          <w:sz w:val="21"/>
+          <w:szCs w:val="21"/>
+        </w:rPr>
+        <w:t>GridSearchCV</w:t>
+      </w:r>
+      <w:proofErr w:type="spellEnd"/>
+      <w:r>
+        <w:rPr>
+          <w:rFonts w:eastAsia="system-ui" w:cs="system-ui"/>
+          <w:color w:val="3B3B3B"/>
+          <w:sz w:val="21"/>
+          <w:szCs w:val="21"/>
+        </w:rPr>
+        <w:t xml:space="preserve"> it was time to check how well it had performed. For this purpose, I used nested cross-validation</w:t>
       </w:r>
       <w:r>
         <w:rPr>
@@ -4161,7 +4741,16 @@
           <w:sz w:val="21"/>
           <w:szCs w:val="21"/>
         </w:rPr>
-        <w:t>The first two implementations went fine but the final one with K-means I had some trouble with.</w:t>
+        <w:t>The first two implementations went fine but the final one with K-means I had some trouble with</w:t>
+      </w:r>
+      <w:r>
+        <w:rPr>
+          <w:rFonts w:eastAsia="system-ui" w:cs="system-ui"/>
+          <w:color w:val="3B3B3B"/>
+          <w:sz w:val="21"/>
+          <w:szCs w:val="21"/>
+        </w:rPr>
+        <w:t xml:space="preserve"> regarding multiple errors that popped up, but I eventually managed to work through all of them.</w:t>
       </w:r>
     </w:p>
     <w:p>
@@ -4191,6 +4780,44 @@
           <w:szCs w:val="21"/>
         </w:rPr>
       </w:pPr>
+      <w:r>
+        <w:rPr>
+          <w:rFonts w:eastAsia="system-ui" w:cs="system-ui"/>
+          <w:color w:val="3B3B3B"/>
+          <w:sz w:val="21"/>
+          <w:szCs w:val="21"/>
+        </w:rPr>
+        <w:t xml:space="preserve">The final step of hyperparameter tuning was to evaluate the models using multiple metrics. </w:t>
+      </w:r>
+      <w:r>
+        <w:rPr>
+          <w:rFonts w:eastAsia="system-ui" w:cs="system-ui"/>
+          <w:color w:val="3B3B3B"/>
+          <w:sz w:val="21"/>
+          <w:szCs w:val="21"/>
+        </w:rPr>
+        <w:t xml:space="preserve"> Evaluated the models using the metrics I evaluated them earlier with, except for clustering, which only had 1 metric originally. I calculated the </w:t>
+      </w:r>
+      <w:proofErr w:type="spellStart"/>
+      <w:r>
+        <w:rPr>
+          <w:rFonts w:eastAsia="system-ui" w:cs="system-ui"/>
+          <w:color w:val="3B3B3B"/>
+          <w:sz w:val="21"/>
+          <w:szCs w:val="21"/>
+        </w:rPr>
+        <w:t>Calinski-Harabasz</w:t>
+      </w:r>
+      <w:proofErr w:type="spellEnd"/>
+      <w:r>
+        <w:rPr>
+          <w:rFonts w:eastAsia="system-ui" w:cs="system-ui"/>
+          <w:color w:val="3B3B3B"/>
+          <w:sz w:val="21"/>
+          <w:szCs w:val="21"/>
+        </w:rPr>
+        <w:t xml:space="preserve"> index for the tuned K-means model.</w:t>
+      </w:r>
     </w:p>
     <w:p>
       <w:pPr>
@@ -4219,6 +4846,15 @@
           <w:szCs w:val="21"/>
         </w:rPr>
       </w:pPr>
+      <w:r>
+        <w:rPr>
+          <w:rFonts w:eastAsia="system-ui" w:cs="system-ui"/>
+          <w:color w:val="3B3B3B"/>
+          <w:sz w:val="21"/>
+          <w:szCs w:val="21"/>
+        </w:rPr>
+        <w:t>The final part of machine learning is to select the best models and save them for potential later use.</w:t>
+      </w:r>
     </w:p>
     <w:p>
       <w:pPr>
@@ -4247,6 +4883,15 @@
           <w:szCs w:val="21"/>
         </w:rPr>
       </w:pPr>
+      <w:r>
+        <w:rPr>
+          <w:rFonts w:eastAsia="system-ui" w:cs="system-ui"/>
+          <w:color w:val="3B3B3B"/>
+          <w:sz w:val="21"/>
+          <w:szCs w:val="21"/>
+        </w:rPr>
+        <w:t>I already compiled the evaluation of all models at the end of each modelling task, so I copied those tables here and made the decision of the best model for each task final: decision tree regressor for regression, random forest classifier for classification, and hierarchical clustering for clustering.</w:t>
+      </w:r>
     </w:p>
     <w:p>
       <w:pPr>
@@ -4262,6 +4907,67 @@
           <w:color w:val="auto"/>
         </w:rPr>
         <w:t>3.6.2: Finalise and Save the Best Model for Each task</w:t>
+      </w:r>
+    </w:p>
+    <w:p>
+      <w:pPr>
+        <w:spacing w:after="120"/>
+        <w:ind w:left="540"/>
+        <w:rPr>
+          <w:rFonts w:eastAsia="system-ui" w:cs="system-ui"/>
+          <w:color w:val="3B3B3B"/>
+          <w:sz w:val="21"/>
+          <w:szCs w:val="21"/>
+        </w:rPr>
+      </w:pPr>
+      <w:r>
+        <w:rPr>
+          <w:rFonts w:eastAsia="system-ui" w:cs="system-ui"/>
+          <w:color w:val="3B3B3B"/>
+          <w:sz w:val="21"/>
+          <w:szCs w:val="21"/>
+        </w:rPr>
+        <w:t xml:space="preserve">The very final step in this creative brief was to save all three models using </w:t>
+      </w:r>
+      <w:proofErr w:type="spellStart"/>
+      <w:r>
+        <w:rPr>
+          <w:rFonts w:eastAsia="system-ui" w:cs="system-ui"/>
+          <w:color w:val="3B3B3B"/>
+          <w:sz w:val="21"/>
+          <w:szCs w:val="21"/>
+        </w:rPr>
+        <w:t>joblib</w:t>
+      </w:r>
+      <w:proofErr w:type="spellEnd"/>
+      <w:r>
+        <w:rPr>
+          <w:rFonts w:eastAsia="system-ui" w:cs="system-ui"/>
+          <w:color w:val="3B3B3B"/>
+          <w:sz w:val="21"/>
+          <w:szCs w:val="21"/>
+        </w:rPr>
+        <w:t xml:space="preserve">. I already trained all models on the full dataset, so all I had to do was use </w:t>
+      </w:r>
+      <w:proofErr w:type="spellStart"/>
+      <w:r>
+        <w:rPr>
+          <w:rFonts w:eastAsia="system-ui" w:cs="system-ui"/>
+          <w:color w:val="3B3B3B"/>
+          <w:sz w:val="21"/>
+          <w:szCs w:val="21"/>
+        </w:rPr>
+        <w:t>joblib.dump</w:t>
+      </w:r>
+      <w:proofErr w:type="spellEnd"/>
+      <w:r>
+        <w:rPr>
+          <w:rFonts w:eastAsia="system-ui" w:cs="system-ui"/>
+          <w:color w:val="3B3B3B"/>
+          <w:sz w:val="21"/>
+          <w:szCs w:val="21"/>
+        </w:rPr>
+        <w:t xml:space="preserve"> to save the models to a file. A problem I encountered with this was the fact that the random forest classifier model would save to a file that is 1.16GB large. This is a problem because GitHub had a file upload limit of 100mb. After compressing the file as much as I could it was still almost 50% over the limit at 145mb. I decided that I could not upload this file to my GitHub repository.</w:t>
       </w:r>
     </w:p>
     <w:p>

</xml_diff>